<commit_message>
Added web based visualization for all 4 algorithms
</commit_message>
<xml_diff>
--- a/Assignment3_Surveillance_Robot.docx
+++ b/Assignment3_Surveillance_Robot.docx
@@ -643,6 +643,9 @@
           <w:szCs w:val="28"/>
         </w:rPr>
         <w:t xml:space="preserve">GitHub Repo with the full code: </w:t>
+      </w:r>
+      <w:r>
+        <w:t>https://github.com/npm-DevPatel/Surveillance-Robot</w:t>
       </w:r>
     </w:p>
     <w:p>
@@ -6288,7 +6291,6 @@
   <w:style w:type="character" w:default="1" w:styleId="DefaultParagraphFont">
     <w:name w:val="Default Paragraph Font"/>
     <w:uiPriority w:val="1"/>
-    <w:semiHidden/>
     <w:unhideWhenUsed/>
   </w:style>
   <w:style w:type="table" w:default="1" w:styleId="TableNormal">

</xml_diff>